<commit_message>
Atualizada a documentação com estrutura hierárquica.
</commit_message>
<xml_diff>
--- a/Documentação/Documentação CPLD.docx
+++ b/Documentação/Documentação CPLD.docx
@@ -4,18 +4,10 @@
   <w:body>
     <w:p>
       <w:pPr>
-        <w:pStyle w:val="Ttulo1"/>
-        <w:numPr>
-          <w:ilvl w:val="0"/>
-          <w:numId w:val="0"/>
-        </w:numPr>
-        <w:ind w:left="432"/>
-      </w:pPr>
-      <w:r>
-        <w:t>Roteiro</w:t>
-      </w:r>
-      <w:r>
-        <w:t xml:space="preserve"> da Documentação CPLD</w:t>
+        <w:pStyle w:val="TtuloPrincipal"/>
+      </w:pPr>
+      <w:r>
+        <w:t>Roteiro da Documentação CPLD</w:t>
       </w:r>
     </w:p>
     <w:p>
@@ -255,14 +247,52 @@
       <w:r>
         <w:t xml:space="preserve">Figura </w:t>
       </w:r>
+      <w:fldSimple w:instr=" SEQ Figura \* ARABIC ">
+        <w:r>
+          <w:rPr>
+            <w:noProof/>
+          </w:rPr>
+          <w:t>1</w:t>
+        </w:r>
+      </w:fldSimple>
+      <w:r>
+        <w:t>: Definições</w:t>
+      </w:r>
+      <w:r>
+        <w:t xml:space="preserve"> de termos usados.</w:t>
+      </w:r>
+    </w:p>
+    <w:p>
+      <w:pPr>
+        <w:pStyle w:val="Ttulo1"/>
+      </w:pPr>
+      <w:bookmarkStart w:id="1" w:name="_Ref78364869"/>
+      <w:bookmarkStart w:id="2" w:name="_Hlk78361774"/>
+      <w:r>
+        <w:lastRenderedPageBreak/>
+        <w:t>Requisitos</w:t>
+      </w:r>
+      <w:bookmarkEnd w:id="1"/>
+    </w:p>
+    <w:bookmarkEnd w:id="2"/>
+    <w:p>
+      <w:r>
+        <w:t>Dos diversos requisitos para o desenvolvimento do projeto, alguns aparecem como destaque</w:t>
+      </w:r>
+      <w:r>
+        <w:t xml:space="preserve"> na </w:t>
+      </w:r>
       <w:r>
         <w:fldChar w:fldCharType="begin"/>
       </w:r>
       <w:r>
-        <w:instrText xml:space="preserve"> SEQ Figura \* ARABIC </w:instrText>
+        <w:instrText xml:space="preserve"> REF _Ref78363749 \h </w:instrText>
       </w:r>
       <w:r>
         <w:fldChar w:fldCharType="separate"/>
+      </w:r>
+      <w:r>
+        <w:t xml:space="preserve">Tabela </w:t>
       </w:r>
       <w:r>
         <w:rPr>
@@ -271,92 +301,28 @@
         <w:t>1</w:t>
       </w:r>
       <w:r>
-        <w:rPr>
-          <w:noProof/>
-        </w:rPr>
         <w:fldChar w:fldCharType="end"/>
       </w:r>
       <w:r>
-        <w:t>: Definições</w:t>
-      </w:r>
-      <w:r>
-        <w:t xml:space="preserve"> de termos usados.</w:t>
-      </w:r>
-    </w:p>
-    <w:p>
-      <w:pPr>
-        <w:pStyle w:val="Ttulo1"/>
-      </w:pPr>
-      <w:bookmarkStart w:id="1" w:name="_Ref78364869"/>
-      <w:bookmarkStart w:id="2" w:name="_Hlk78361774"/>
-      <w:r>
-        <w:lastRenderedPageBreak/>
-        <w:t>Requisitos</w:t>
-      </w:r>
-      <w:bookmarkEnd w:id="1"/>
-    </w:p>
-    <w:bookmarkEnd w:id="2"/>
-    <w:p>
-      <w:r>
-        <w:t>Dos diversos requisitos para o desenvolvimento do projeto, alguns aparecem como destaque</w:t>
-      </w:r>
-      <w:r>
-        <w:t xml:space="preserve"> na </w:t>
-      </w:r>
-      <w:r>
-        <w:fldChar w:fldCharType="begin"/>
-      </w:r>
-      <w:r>
-        <w:instrText xml:space="preserve"> REF _Ref78363749 \h </w:instrText>
-      </w:r>
-      <w:r>
-        <w:fldChar w:fldCharType="separate"/>
-      </w:r>
+        <w:t>.</w:t>
+      </w:r>
+    </w:p>
+    <w:p>
+      <w:pPr>
+        <w:pStyle w:val="Legenda"/>
+      </w:pPr>
+      <w:bookmarkStart w:id="3" w:name="_Ref78363749"/>
       <w:r>
         <w:t xml:space="preserve">Tabela </w:t>
       </w:r>
-      <w:r>
-        <w:rPr>
-          <w:noProof/>
-        </w:rPr>
-        <w:t>1</w:t>
-      </w:r>
-      <w:r>
-        <w:fldChar w:fldCharType="end"/>
-      </w:r>
-      <w:r>
-        <w:t>.</w:t>
-      </w:r>
-    </w:p>
-    <w:p>
-      <w:pPr>
-        <w:pStyle w:val="Legenda"/>
-      </w:pPr>
-      <w:bookmarkStart w:id="3" w:name="_Ref78363749"/>
-      <w:r>
-        <w:t xml:space="preserve">Tabela </w:t>
-      </w:r>
-      <w:r>
-        <w:fldChar w:fldCharType="begin"/>
-      </w:r>
-      <w:r>
-        <w:instrText xml:space="preserve"> SEQ Tabela \* ARABIC </w:instrText>
-      </w:r>
-      <w:r>
-        <w:fldChar w:fldCharType="separate"/>
-      </w:r>
-      <w:r>
-        <w:rPr>
-          <w:noProof/>
-        </w:rPr>
-        <w:t>1</w:t>
-      </w:r>
-      <w:r>
-        <w:rPr>
-          <w:noProof/>
-        </w:rPr>
-        <w:fldChar w:fldCharType="end"/>
-      </w:r>
+      <w:fldSimple w:instr=" SEQ Tabela \* ARABIC ">
+        <w:r>
+          <w:rPr>
+            <w:noProof/>
+          </w:rPr>
+          <w:t>1</w:t>
+        </w:r>
+      </w:fldSimple>
       <w:bookmarkEnd w:id="3"/>
       <w:r>
         <w:t>: Requisitos do sistema</w:t>
@@ -1228,27 +1194,14 @@
       <w:r>
         <w:t xml:space="preserve">Figura </w:t>
       </w:r>
-      <w:r>
-        <w:fldChar w:fldCharType="begin"/>
-      </w:r>
-      <w:r>
-        <w:instrText xml:space="preserve"> SEQ Figura \* ARABIC </w:instrText>
-      </w:r>
-      <w:r>
-        <w:fldChar w:fldCharType="separate"/>
-      </w:r>
-      <w:r>
-        <w:rPr>
-          <w:noProof/>
-        </w:rPr>
-        <w:t>2</w:t>
-      </w:r>
-      <w:r>
-        <w:rPr>
-          <w:noProof/>
-        </w:rPr>
-        <w:fldChar w:fldCharType="end"/>
-      </w:r>
+      <w:fldSimple w:instr=" SEQ Figura \* ARABIC ">
+        <w:r>
+          <w:rPr>
+            <w:noProof/>
+          </w:rPr>
+          <w:t>2</w:t>
+        </w:r>
+      </w:fldSimple>
       <w:bookmarkEnd w:id="6"/>
       <w:r>
         <w:t>: Protocolo SPI modo SPI-00-S.</w:t>
@@ -1356,14 +1309,27 @@
       <w:r>
         <w:t xml:space="preserve">Figura </w:t>
       </w:r>
-      <w:fldSimple w:instr=" SEQ Figura \* ARABIC ">
-        <w:r>
-          <w:rPr>
-            <w:noProof/>
-          </w:rPr>
-          <w:t>3</w:t>
-        </w:r>
-      </w:fldSimple>
+      <w:r>
+        <w:fldChar w:fldCharType="begin"/>
+      </w:r>
+      <w:r>
+        <w:instrText xml:space="preserve"> SEQ Figura \* ARABIC </w:instrText>
+      </w:r>
+      <w:r>
+        <w:fldChar w:fldCharType="separate"/>
+      </w:r>
+      <w:r>
+        <w:rPr>
+          <w:noProof/>
+        </w:rPr>
+        <w:t>3</w:t>
+      </w:r>
+      <w:r>
+        <w:rPr>
+          <w:noProof/>
+        </w:rPr>
+        <w:fldChar w:fldCharType="end"/>
+      </w:r>
       <w:bookmarkEnd w:id="8"/>
       <w:r>
         <w:t>: Modos de trabalho da CPLD</w:t>
@@ -1498,27 +1464,14 @@
       <w:r>
         <w:t xml:space="preserve">Figura </w:t>
       </w:r>
-      <w:r>
-        <w:fldChar w:fldCharType="begin"/>
-      </w:r>
-      <w:r>
-        <w:instrText xml:space="preserve"> SEQ Figura \* ARABIC </w:instrText>
-      </w:r>
-      <w:r>
-        <w:fldChar w:fldCharType="separate"/>
-      </w:r>
-      <w:r>
-        <w:rPr>
-          <w:noProof/>
-        </w:rPr>
-        <w:t>4</w:t>
-      </w:r>
-      <w:r>
-        <w:rPr>
-          <w:noProof/>
-        </w:rPr>
-        <w:fldChar w:fldCharType="end"/>
-      </w:r>
+      <w:fldSimple w:instr=" SEQ Figura \* ARABIC ">
+        <w:r>
+          <w:rPr>
+            <w:noProof/>
+          </w:rPr>
+          <w:t>4</w:t>
+        </w:r>
+      </w:fldSimple>
       <w:bookmarkEnd w:id="10"/>
       <w:r>
         <w:t xml:space="preserve">: Bits de configuração da CPLD no </w:t>
@@ -1767,14 +1720,27 @@
       <w:r>
         <w:t xml:space="preserve">Figura </w:t>
       </w:r>
-      <w:fldSimple w:instr=" SEQ Figura \* ARABIC ">
-        <w:r>
-          <w:rPr>
-            <w:noProof/>
-          </w:rPr>
-          <w:t>5</w:t>
-        </w:r>
-      </w:fldSimple>
+      <w:r>
+        <w:fldChar w:fldCharType="begin"/>
+      </w:r>
+      <w:r>
+        <w:instrText xml:space="preserve"> SEQ Figura \* ARABIC </w:instrText>
+      </w:r>
+      <w:r>
+        <w:fldChar w:fldCharType="separate"/>
+      </w:r>
+      <w:r>
+        <w:rPr>
+          <w:noProof/>
+        </w:rPr>
+        <w:t>5</w:t>
+      </w:r>
+      <w:r>
+        <w:rPr>
+          <w:noProof/>
+        </w:rPr>
+        <w:fldChar w:fldCharType="end"/>
+      </w:r>
       <w:bookmarkEnd w:id="12"/>
       <w:r>
         <w:t xml:space="preserve">: Modo Daisy-Chain (fonte: </w:t>
@@ -1970,15 +1936,208 @@
         <w:pStyle w:val="Ttulo2"/>
       </w:pPr>
       <w:r>
-        <w:t>Principais</w:t>
-      </w:r>
-      <w:r>
-        <w:t xml:space="preserve"> Unidades</w:t>
-      </w:r>
-    </w:p>
-    <w:p>
-      <w:r>
-        <w:t xml:space="preserve">A seguir são descritas as principais unidades </w:t>
+        <w:t>Unidades</w:t>
+      </w:r>
+      <w:r>
+        <w:t xml:space="preserve"> Funcionais</w:t>
+      </w:r>
+    </w:p>
+    <w:p>
+      <w:r>
+        <w:t xml:space="preserve">O projeto da CPLD foi desenvolvido em AHDL tendo uma planta gráfica principal utilizando o ambiente </w:t>
+      </w:r>
+      <w:proofErr w:type="spellStart"/>
+      <w:r>
+        <w:t>Quartus</w:t>
+      </w:r>
+      <w:proofErr w:type="spellEnd"/>
+      <w:r>
+        <w:t xml:space="preserve"> Prime Lite </w:t>
+      </w:r>
+      <w:proofErr w:type="spellStart"/>
+      <w:r>
+        <w:t>Edition</w:t>
+      </w:r>
+      <w:proofErr w:type="spellEnd"/>
+      <w:r>
+        <w:t xml:space="preserve">. A </w:t>
+      </w:r>
+      <w:r>
+        <w:fldChar w:fldCharType="begin"/>
+      </w:r>
+      <w:r>
+        <w:instrText xml:space="preserve"> REF _Ref78463491 \h </w:instrText>
+      </w:r>
+      <w:r>
+        <w:fldChar w:fldCharType="separate"/>
+      </w:r>
+      <w:r>
+        <w:t xml:space="preserve">Figura </w:t>
+      </w:r>
+      <w:r>
+        <w:rPr>
+          <w:noProof/>
+        </w:rPr>
+        <w:t>6</w:t>
+      </w:r>
+      <w:r>
+        <w:fldChar w:fldCharType="end"/>
+      </w:r>
+      <w:r>
+        <w:t xml:space="preserve"> apresenta a estrutura hierárquica do projeto.</w:t>
+      </w:r>
+    </w:p>
+    <w:p>
+      <w:pPr>
+        <w:keepNext/>
+        <w:jc w:val="center"/>
+      </w:pPr>
+      <w:r>
+        <w:rPr>
+          <w:noProof/>
+        </w:rPr>
+        <w:lastRenderedPageBreak/>
+        <w:drawing>
+          <wp:inline distT="0" distB="0" distL="0" distR="0" wp14:anchorId="146EF78C" wp14:editId="001B74F4">
+            <wp:extent cx="1962150" cy="2200275"/>
+            <wp:effectExtent l="0" t="0" r="0" b="9525"/>
+            <wp:docPr id="3" name="Imagem 3"/>
+            <wp:cNvGraphicFramePr>
+              <a:graphicFrameLocks xmlns:a="http://schemas.openxmlformats.org/drawingml/2006/main" noChangeAspect="1"/>
+            </wp:cNvGraphicFramePr>
+            <a:graphic xmlns:a="http://schemas.openxmlformats.org/drawingml/2006/main">
+              <a:graphicData uri="http://schemas.openxmlformats.org/drawingml/2006/picture">
+                <pic:pic xmlns:pic="http://schemas.openxmlformats.org/drawingml/2006/picture">
+                  <pic:nvPicPr>
+                    <pic:cNvPr id="1" name=""/>
+                    <pic:cNvPicPr/>
+                  </pic:nvPicPr>
+                  <pic:blipFill>
+                    <a:blip r:embed="rId13"/>
+                    <a:stretch>
+                      <a:fillRect/>
+                    </a:stretch>
+                  </pic:blipFill>
+                  <pic:spPr>
+                    <a:xfrm>
+                      <a:off x="0" y="0"/>
+                      <a:ext cx="1962150" cy="2200275"/>
+                    </a:xfrm>
+                    <a:prstGeom prst="rect">
+                      <a:avLst/>
+                    </a:prstGeom>
+                  </pic:spPr>
+                </pic:pic>
+              </a:graphicData>
+            </a:graphic>
+          </wp:inline>
+        </w:drawing>
+      </w:r>
+    </w:p>
+    <w:p>
+      <w:pPr>
+        <w:pStyle w:val="Legenda"/>
+      </w:pPr>
+      <w:bookmarkStart w:id="14" w:name="_Ref78463491"/>
+      <w:r>
+        <w:t xml:space="preserve">Figura </w:t>
+      </w:r>
+      <w:fldSimple w:instr=" SEQ Figura \* ARABIC ">
+        <w:r>
+          <w:rPr>
+            <w:noProof/>
+          </w:rPr>
+          <w:t>6</w:t>
+        </w:r>
+      </w:fldSimple>
+      <w:bookmarkEnd w:id="14"/>
+      <w:r>
+        <w:t xml:space="preserve">: Estrutura hierárquica do projeto Sensor de Buchas no </w:t>
+      </w:r>
+      <w:proofErr w:type="spellStart"/>
+      <w:r>
+        <w:t>Quartus</w:t>
+      </w:r>
+      <w:proofErr w:type="spellEnd"/>
+      <w:r>
+        <w:t>.</w:t>
+      </w:r>
+    </w:p>
+    <w:p>
+      <w:pPr>
+        <w:rPr>
+          <w:u w:val="single"/>
+        </w:rPr>
+      </w:pPr>
+      <w:r>
+        <w:t>A ??? apresenta o a</w:t>
+      </w:r>
+      <w:r>
+        <w:t>r</w:t>
+      </w:r>
+      <w:r>
+        <w:t>quivo principal do projeto.</w:t>
+      </w:r>
+    </w:p>
+    <w:p>
+      <w:pPr>
+        <w:rPr>
+          <w:u w:val="single"/>
+        </w:rPr>
+      </w:pPr>
+      <w:r>
+        <w:rPr>
+          <w:noProof/>
+          <w:u w:val="single"/>
+        </w:rPr>
+        <w:drawing>
+          <wp:inline distT="0" distB="0" distL="0" distR="0" wp14:anchorId="73962BEB" wp14:editId="14CAE66D">
+            <wp:extent cx="5391150" cy="3271520"/>
+            <wp:effectExtent l="0" t="0" r="0" b="5080"/>
+            <wp:docPr id="4" name="Imagem 4"/>
+            <wp:cNvGraphicFramePr>
+              <a:graphicFrameLocks xmlns:a="http://schemas.openxmlformats.org/drawingml/2006/main" noChangeAspect="1"/>
+            </wp:cNvGraphicFramePr>
+            <a:graphic xmlns:a="http://schemas.openxmlformats.org/drawingml/2006/main">
+              <a:graphicData uri="http://schemas.openxmlformats.org/drawingml/2006/picture">
+                <pic:pic xmlns:pic="http://schemas.openxmlformats.org/drawingml/2006/picture">
+                  <pic:nvPicPr>
+                    <pic:cNvPr id="0" name="Picture 1"/>
+                    <pic:cNvPicPr>
+                      <a:picLocks noChangeAspect="1" noChangeArrowheads="1"/>
+                    </pic:cNvPicPr>
+                  </pic:nvPicPr>
+                  <pic:blipFill>
+                    <a:blip r:embed="rId14" cstate="print">
+                      <a:extLst>
+                        <a:ext uri="{28A0092B-C50C-407E-A947-70E740481C1C}">
+                          <a14:useLocalDpi xmlns:a14="http://schemas.microsoft.com/office/drawing/2010/main" val="0"/>
+                        </a:ext>
+                      </a:extLst>
+                    </a:blip>
+                    <a:srcRect/>
+                    <a:stretch>
+                      <a:fillRect/>
+                    </a:stretch>
+                  </pic:blipFill>
+                  <pic:spPr bwMode="auto">
+                    <a:xfrm>
+                      <a:off x="0" y="0"/>
+                      <a:ext cx="5391150" cy="3271520"/>
+                    </a:xfrm>
+                    <a:prstGeom prst="rect">
+                      <a:avLst/>
+                    </a:prstGeom>
+                    <a:noFill/>
+                    <a:ln>
+                      <a:noFill/>
+                    </a:ln>
+                  </pic:spPr>
+                </pic:pic>
+              </a:graphicData>
+            </a:graphic>
+          </wp:inline>
+        </w:drawing>
       </w:r>
     </w:p>
     <w:p>
@@ -1986,7 +2145,6 @@
         <w:pStyle w:val="Ttulo3"/>
       </w:pPr>
       <w:r>
-        <w:lastRenderedPageBreak/>
         <w:t>RESET_MODULE</w:t>
       </w:r>
     </w:p>
@@ -2097,6 +2255,7 @@
         </w:numPr>
       </w:pPr>
       <w:r>
+        <w:lastRenderedPageBreak/>
         <w:t>HOST_INTERFACE</w:t>
       </w:r>
     </w:p>
@@ -4518,6 +4677,36 @@
       <w:jc w:val="center"/>
     </w:pPr>
   </w:style>
+  <w:style w:type="paragraph" w:customStyle="1" w:styleId="TtuloPrincipal">
+    <w:name w:val="Título Principal"/>
+    <w:basedOn w:val="Ttulo1"/>
+    <w:link w:val="TtuloPrincipalChar"/>
+    <w:qFormat/>
+    <w:rsid w:val="0066018D"/>
+    <w:pPr>
+      <w:numPr>
+        <w:numId w:val="0"/>
+      </w:numPr>
+    </w:pPr>
+    <w:rPr>
+      <w:b/>
+      <w:bCs/>
+    </w:rPr>
+  </w:style>
+  <w:style w:type="character" w:customStyle="1" w:styleId="TtuloPrincipalChar">
+    <w:name w:val="Título Principal Char"/>
+    <w:basedOn w:val="Ttulo1Char"/>
+    <w:link w:val="TtuloPrincipal"/>
+    <w:rsid w:val="0066018D"/>
+    <w:rPr>
+      <w:rFonts w:asciiTheme="majorHAnsi" w:eastAsiaTheme="majorEastAsia" w:hAnsiTheme="majorHAnsi" w:cstheme="majorBidi"/>
+      <w:b/>
+      <w:bCs/>
+      <w:color w:val="2F5496" w:themeColor="accent1" w:themeShade="BF"/>
+      <w:sz w:val="40"/>
+      <w:szCs w:val="40"/>
+    </w:rPr>
+  </w:style>
 </w:styles>
 </file>
 

</xml_diff>